<commit_message>
more micro added of aws
</commit_message>
<xml_diff>
--- a/Masters2/Micro/android_1.docx
+++ b/Masters2/Micro/android_1.docx
@@ -4,23 +4,24 @@
   <w:body>
     <w:p>
       <w:pPr>
-        <w:spacing w:before="100" w:beforeAutospacing="1" w:after="100" w:afterAutospacing="1" w:line="240" w:lineRule="auto"/>
-        <w:rPr>
-          <w:rFonts w:ascii="Arial Black" w:eastAsia="Times New Roman" w:hAnsi="Arial Black" w:cs="Times New Roman"/>
-          <w:kern w:val="0"/>
-          <w:sz w:val="24"/>
-          <w:szCs w:val="24"/>
-          <w:lang w:eastAsia="en-IN" w:bidi="gu-IN"/>
-          <w14:ligatures w14:val="none"/>
-        </w:rPr>
-      </w:pPr>
-      <w:r>
-        <w:rPr>
-          <w:rFonts w:ascii="Arial Black" w:eastAsia="Times New Roman" w:hAnsi="Arial Black" w:cs="Times New Roman"/>
+        <w:pStyle w:val="ListParagraph"/>
+        <w:numPr>
+          <w:ilvl w:val="0"/>
+          <w:numId w:val="1"/>
+        </w:numPr>
+        <w:spacing w:before="100" w:beforeAutospacing="1" w:after="100" w:afterAutospacing="1" w:line="240" w:lineRule="auto"/>
+        <w:rPr>
+          <w:rFonts w:ascii="Arial Black" w:eastAsia="Times New Roman" w:hAnsi="Arial Black" w:cs="Times New Roman"/>
+          <w:kern w:val="0"/>
+          <w:sz w:val="24"/>
+          <w:szCs w:val="24"/>
+          <w:lang w:eastAsia="en-IN" w:bidi="gu-IN"/>
+          <w14:ligatures w14:val="none"/>
+        </w:rPr>
+      </w:pPr>
+      <w:r>
+        <w:rPr>
           <w:noProof/>
-          <w:kern w:val="0"/>
-          <w:sz w:val="24"/>
-          <w:szCs w:val="24"/>
           <w:lang w:eastAsia="en-IN" w:bidi="gu-IN"/>
         </w:rPr>
         <mc:AlternateContent>
@@ -28,14 +29,14 @@
             <w:drawing>
               <wp:anchor distT="0" distB="0" distL="114300" distR="114300" simplePos="0" relativeHeight="251659264" behindDoc="0" locked="0" layoutInCell="1" allowOverlap="1">
                 <wp:simplePos x="0" y="0"/>
-                <wp:positionH relativeFrom="column">
-                  <wp:posOffset>1364615</wp:posOffset>
+                <wp:positionH relativeFrom="margin">
+                  <wp:posOffset>1311275</wp:posOffset>
                 </wp:positionH>
                 <wp:positionV relativeFrom="paragraph">
-                  <wp:posOffset>-232410</wp:posOffset>
+                  <wp:posOffset>-491490</wp:posOffset>
                 </wp:positionV>
-                <wp:extent cx="4800600" cy="563880"/>
-                <wp:effectExtent l="0" t="0" r="19050" b="26670"/>
+                <wp:extent cx="6027420" cy="601980"/>
+                <wp:effectExtent l="0" t="0" r="0" b="7620"/>
                 <wp:wrapNone/>
                 <wp:docPr id="20" name="Text Box 20"/>
                 <wp:cNvGraphicFramePr/>
@@ -46,18 +47,14 @@
                       <wps:spPr>
                         <a:xfrm>
                           <a:off x="0" y="0"/>
-                          <a:ext cx="4800600" cy="563880"/>
+                          <a:ext cx="6027420" cy="601980"/>
                         </a:xfrm>
                         <a:prstGeom prst="rect">
                           <a:avLst/>
                         </a:prstGeom>
-                        <a:solidFill>
-                          <a:schemeClr val="lt1"/>
-                        </a:solidFill>
+                        <a:noFill/>
                         <a:ln w="6350">
-                          <a:solidFill>
-                            <a:prstClr val="black"/>
-                          </a:solidFill>
+                          <a:noFill/>
                         </a:ln>
                         <a:effectLst/>
                       </wps:spPr>
@@ -79,9 +76,13 @@
                         <w:txbxContent>
                           <w:p>
                             <w:pPr>
+                              <w:pBdr>
+                                <w:bottom w:val="single" w:sz="4" w:space="1" w:color="auto"/>
+                              </w:pBdr>
                               <w:rPr>
                                 <w:sz w:val="56"/>
                                 <w:szCs w:val="56"/>
+                                <w:u w:val="thick"/>
                               </w:rPr>
                             </w:pPr>
                             <w:r>
@@ -92,6 +93,7 @@
                                 <w:kern w:val="0"/>
                                 <w:sz w:val="56"/>
                                 <w:szCs w:val="56"/>
+                                <w:u w:val="thick"/>
                                 <w:lang w:eastAsia="en-IN" w:bidi="gu-IN"/>
                                 <w14:ligatures w14:val="none"/>
                               </w:rPr>
@@ -124,14 +126,18 @@
                 <v:stroke joinstyle="miter"/>
                 <v:path gradientshapeok="t" o:connecttype="rect"/>
               </v:shapetype>
-              <v:shape id="Text Box 20" o:spid="_x0000_s1026" type="#_x0000_t202" style="position:absolute;margin-left:107.45pt;margin-top:-18.3pt;width:378pt;height:44.4pt;z-index:251659264;visibility:visible;mso-wrap-style:square;mso-width-percent:0;mso-height-percent:0;mso-wrap-distance-left:9pt;mso-wrap-distance-top:0;mso-wrap-distance-right:9pt;mso-wrap-distance-bottom:0;mso-position-horizontal:absolute;mso-position-horizontal-relative:text;mso-position-vertical:absolute;mso-position-vertical-relative:text;mso-width-percent:0;mso-height-percent:0;mso-width-relative:margin;mso-height-relative:margin;v-text-anchor:top" o:gfxdata="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" fillcolor="white [3201]" strokeweight=".5pt">
+              <v:shape id="Text Box 20" o:spid="_x0000_s1026" type="#_x0000_t202" style="position:absolute;left:0;text-align:left;margin-left:103.25pt;margin-top:-38.7pt;width:474.6pt;height:47.4pt;z-index:251659264;visibility:visible;mso-wrap-style:square;mso-width-percent:0;mso-height-percent:0;mso-wrap-distance-left:9pt;mso-wrap-distance-top:0;mso-wrap-distance-right:9pt;mso-wrap-distance-bottom:0;mso-position-horizontal:absolute;mso-position-horizontal-relative:margin;mso-position-vertical:absolute;mso-position-vertical-relative:text;mso-width-percent:0;mso-height-percent:0;mso-width-relative:margin;mso-height-relative:margin;v-text-anchor:top" o:gfxdata="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" filled="f" stroked="f" strokeweight=".5pt">
                 <v:textbox>
                   <w:txbxContent>
                     <w:p>
                       <w:pPr>
+                        <w:pBdr>
+                          <w:bottom w:val="single" w:sz="4" w:space="1" w:color="auto"/>
+                        </w:pBdr>
                         <w:rPr>
                           <w:sz w:val="56"/>
                           <w:szCs w:val="56"/>
+                          <w:u w:val="thick"/>
                         </w:rPr>
                       </w:pPr>
                       <w:r>
@@ -142,6 +148,7 @@
                           <w:kern w:val="0"/>
                           <w:sz w:val="56"/>
                           <w:szCs w:val="56"/>
+                          <w:u w:val="thick"/>
                           <w:lang w:eastAsia="en-IN" w:bidi="gu-IN"/>
                           <w14:ligatures w14:val="none"/>
                         </w:rPr>
@@ -150,28 +157,12 @@
                     </w:p>
                   </w:txbxContent>
                 </v:textbox>
+                <w10:wrap anchorx="margin"/>
               </v:shape>
             </w:pict>
           </mc:Fallback>
         </mc:AlternateContent>
       </w:r>
-    </w:p>
-    <w:p>
-      <w:pPr>
-        <w:numPr>
-          <w:ilvl w:val="0"/>
-          <w:numId w:val="1"/>
-        </w:numPr>
-        <w:spacing w:before="100" w:beforeAutospacing="1" w:after="100" w:afterAutospacing="1" w:line="240" w:lineRule="auto"/>
-        <w:rPr>
-          <w:rFonts w:ascii="Arial Black" w:eastAsia="Times New Roman" w:hAnsi="Arial Black" w:cs="Times New Roman"/>
-          <w:kern w:val="0"/>
-          <w:sz w:val="24"/>
-          <w:szCs w:val="24"/>
-          <w:lang w:eastAsia="en-IN" w:bidi="gu-IN"/>
-          <w14:ligatures w14:val="none"/>
-        </w:rPr>
-      </w:pPr>
       <w:r>
         <w:rPr>
           <w:rFonts w:ascii="Arial Black" w:eastAsia="Times New Roman" w:hAnsi="Arial Black" w:cs="Times New Roman"/>
@@ -2484,7 +2475,6 @@
           <w:szCs w:val="24"/>
           <w:lang w:eastAsia="en-IN" w:bidi="gu-IN"/>
         </w:rPr>
-        <w:lastRenderedPageBreak/>
         <mc:AlternateContent>
           <mc:Choice Requires="wps">
             <w:drawing>
@@ -2706,6 +2696,7 @@
           <w:lang w:eastAsia="en-IN" w:bidi="gu-IN"/>
           <w14:ligatures w14:val="none"/>
         </w:rPr>
+        <w:lastRenderedPageBreak/>
         <w:t>Lifecycle Methods</w:t>
       </w:r>
     </w:p>
@@ -6487,10 +6478,6 @@
           </mc:Choice>
           <mc:Fallback>
             <w:pict>
-              <v:shapetype id="_x0000_t202" coordsize="21600,21600" o:spt="202" path="m,l,21600r21600,l21600,xe">
-                <v:stroke joinstyle="miter"/>
-                <v:path gradientshapeok="t" o:connecttype="rect"/>
-              </v:shapetype>
               <v:shape id="Text Box 1" o:spid="_x0000_s1034" type="#_x0000_t202" style="position:absolute;left:0;text-align:left;margin-left:229.85pt;margin-top:.45pt;width:315pt;height:22.8pt;z-index:251673600;visibility:visible;mso-wrap-style:square;mso-height-percent:0;mso-wrap-distance-left:9pt;mso-wrap-distance-top:0;mso-wrap-distance-right:9pt;mso-wrap-distance-bottom:0;mso-position-horizontal:absolute;mso-position-horizontal-relative:text;mso-position-vertical:absolute;mso-position-vertical-relative:text;mso-height-percent:0;mso-height-relative:margin;v-text-anchor:top" o:gfxdata="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" filled="f" stroked="f" strokeweight=".5pt">
                 <v:textbox>
                   <w:txbxContent>
@@ -12071,20 +12058,7 @@
           <w:lang w:eastAsia="en-IN" w:bidi="gu-IN"/>
           <w14:ligatures w14:val="none"/>
         </w:rPr>
-        <w:t>ArrayAdapter is a bridge between an array or list of data and a UI component like ListView</w:t>
-      </w:r>
-      <w:bookmarkStart w:id="0" w:name="_GoBack"/>
-      <w:bookmarkEnd w:id="0"/>
-      <w:r>
-        <w:rPr>
-          <w:rFonts w:ascii="Arial Black" w:eastAsia="Times New Roman" w:hAnsi="Arial Black" w:cs="Times New Roman"/>
-          <w:kern w:val="0"/>
-          <w:sz w:val="24"/>
-          <w:szCs w:val="24"/>
-          <w:lang w:eastAsia="en-IN" w:bidi="gu-IN"/>
-          <w14:ligatures w14:val="none"/>
-        </w:rPr>
-        <w:t xml:space="preserve"> or Spinner</w:t>
+        <w:t>ArrayAdapter is a bridge between an array or list of data and a UI component like ListView or Spinner</w:t>
       </w:r>
       <w:r>
         <w:rPr>
@@ -12398,15 +12372,56 @@
     </w:p>
     <w:p>
       <w:pPr>
-        <w:numPr>
-          <w:ilvl w:val="0"/>
+        <w:spacing w:before="100" w:beforeAutospacing="1" w:after="100" w:afterAutospacing="1" w:line="240" w:lineRule="auto"/>
+        <w:rPr>
+          <w:rFonts w:ascii="Arial Black" w:eastAsia="Times New Roman" w:hAnsi="Arial Black" w:cs="Times New Roman"/>
+          <w:b/>
+          <w:bCs/>
+          <w:kern w:val="0"/>
+          <w:sz w:val="24"/>
+          <w:szCs w:val="24"/>
+          <w:lang w:eastAsia="en-IN" w:bidi="gu-IN"/>
+          <w14:ligatures w14:val="none"/>
+        </w:rPr>
+      </w:pPr>
+    </w:p>
+    <w:p>
+      <w:pPr>
+        <w:numPr>
+          <w:ilvl w:val="1"/>
           <w:numId w:val="36"/>
         </w:numPr>
         <w:spacing w:before="100" w:beforeAutospacing="1" w:after="100" w:afterAutospacing="1" w:line="240" w:lineRule="auto"/>
         <w:rPr>
           <w:rFonts w:ascii="Arial Black" w:eastAsia="Times New Roman" w:hAnsi="Arial Black" w:cs="Times New Roman"/>
-          <w:b/>
-          <w:bCs/>
+          <w:kern w:val="0"/>
+          <w:sz w:val="24"/>
+          <w:szCs w:val="24"/>
+          <w:lang w:eastAsia="en-IN" w:bidi="gu-IN"/>
+          <w14:ligatures w14:val="none"/>
+        </w:rPr>
+      </w:pPr>
+      <w:r>
+        <w:rPr>
+          <w:rFonts w:ascii="Arial Black" w:eastAsia="Times New Roman" w:hAnsi="Arial Black" w:cs="Times New Roman"/>
+          <w:kern w:val="0"/>
+          <w:sz w:val="24"/>
+          <w:szCs w:val="24"/>
+          <w:lang w:eastAsia="en-IN" w:bidi="gu-IN"/>
+          <w14:ligatures w14:val="none"/>
+        </w:rPr>
+        <w:t xml:space="preserve">Uses predefined layouts like simple_list_item_1 </w:t>
+      </w:r>
+    </w:p>
+    <w:p>
+      <w:pPr>
+        <w:numPr>
+          <w:ilvl w:val="1"/>
+          <w:numId w:val="36"/>
+        </w:numPr>
+        <w:spacing w:before="100" w:beforeAutospacing="1" w:after="100" w:afterAutospacing="1" w:line="240" w:lineRule="auto"/>
+        <w:rPr>
+          <w:rFonts w:ascii="Arial Black" w:eastAsia="Times New Roman" w:hAnsi="Arial Black" w:cs="Times New Roman"/>
           <w:kern w:val="0"/>
           <w:sz w:val="24"/>
           <w:szCs w:val="24"/>
@@ -12421,6 +12436,17 @@
           <w:docGrid w:linePitch="360"/>
         </w:sectPr>
       </w:pPr>
+      <w:r>
+        <w:rPr>
+          <w:rFonts w:ascii="Arial Black" w:eastAsia="Times New Roman" w:hAnsi="Arial Black" w:cs="Times New Roman"/>
+          <w:kern w:val="0"/>
+          <w:sz w:val="24"/>
+          <w:szCs w:val="24"/>
+          <w:lang w:eastAsia="en-IN" w:bidi="gu-IN"/>
+          <w14:ligatures w14:val="none"/>
+        </w:rPr>
+        <w:t>Can be customized with custom XML layout</w:t>
+      </w:r>
     </w:p>
     <w:p>
       <w:pPr>
@@ -12827,7 +12853,74 @@
           <w:lang w:eastAsia="en-IN" w:bidi="gu-IN"/>
           <w14:ligatures w14:val="none"/>
         </w:rPr>
-        <w:t xml:space="preserve">Automatically handles data mapping </w:t>
+        <w:t>Automatically handles data mapping</w:t>
+      </w:r>
+    </w:p>
+    <w:p>
+      <w:pPr>
+        <w:numPr>
+          <w:ilvl w:val="1"/>
+          <w:numId w:val="37"/>
+        </w:numPr>
+        <w:spacing w:before="100" w:beforeAutospacing="1" w:after="100" w:afterAutospacing="1" w:line="240" w:lineRule="auto"/>
+        <w:rPr>
+          <w:rFonts w:ascii="Arial Black" w:eastAsia="Times New Roman" w:hAnsi="Arial Black" w:cs="Times New Roman"/>
+          <w:kern w:val="0"/>
+          <w:sz w:val="24"/>
+          <w:szCs w:val="24"/>
+          <w:lang w:eastAsia="en-IN" w:bidi="gu-IN"/>
+          <w14:ligatures w14:val="none"/>
+        </w:rPr>
+      </w:pPr>
+      <w:r>
+        <w:rPr>
+          <w:rFonts w:ascii="Arial Black" w:eastAsia="Times New Roman" w:hAnsi="Arial Black" w:cs="Times New Roman"/>
+          <w:kern w:val="0"/>
+          <w:sz w:val="24"/>
+          <w:szCs w:val="24"/>
+          <w:lang w:eastAsia="en-IN" w:bidi="gu-IN"/>
+          <w14:ligatures w14:val="none"/>
+        </w:rPr>
+        <w:t>Works directly with SQLite queries</w:t>
+      </w:r>
+    </w:p>
+    <w:p>
+      <w:pPr>
+        <w:numPr>
+          <w:ilvl w:val="1"/>
+          <w:numId w:val="37"/>
+        </w:numPr>
+        <w:spacing w:before="100" w:beforeAutospacing="1" w:after="100" w:afterAutospacing="1" w:line="240" w:lineRule="auto"/>
+        <w:rPr>
+          <w:rFonts w:ascii="Arial Black" w:eastAsia="Times New Roman" w:hAnsi="Arial Black" w:cs="Times New Roman"/>
+          <w:kern w:val="0"/>
+          <w:sz w:val="24"/>
+          <w:szCs w:val="24"/>
+          <w:lang w:eastAsia="en-IN" w:bidi="gu-IN"/>
+          <w14:ligatures w14:val="none"/>
+        </w:rPr>
+      </w:pPr>
+      <w:r>
+        <w:rPr>
+          <w:rFonts w:ascii="Arial Black" w:eastAsia="Times New Roman" w:hAnsi="Arial Black" w:cs="Times New Roman"/>
+          <w:kern w:val="0"/>
+          <w:sz w:val="24"/>
+          <w:szCs w:val="24"/>
+          <w:lang w:eastAsia="en-IN" w:bidi="gu-IN"/>
+          <w14:ligatures w14:val="none"/>
+        </w:rPr>
+        <w:t>Requires column-to-view ID mapping</w:t>
+      </w:r>
+      <w:r>
+        <w:rPr>
+          <w:rFonts w:ascii="Arial Black" w:eastAsia="Times New Roman" w:hAnsi="Arial Black" w:cs="Times New Roman"/>
+          <w:kern w:val="0"/>
+          <w:sz w:val="24"/>
+          <w:szCs w:val="24"/>
+          <w:lang w:eastAsia="en-IN" w:bidi="gu-IN"/>
+          <w14:ligatures w14:val="none"/>
+        </w:rPr>
+        <w:t xml:space="preserve"> </w:t>
       </w:r>
     </w:p>
     <w:p>
@@ -13278,11 +13371,8 @@
     </w:p>
     <w:p>
       <w:pPr>
-        <w:numPr>
-          <w:ilvl w:val="0"/>
-          <w:numId w:val="38"/>
-        </w:numPr>
-        <w:spacing w:before="100" w:beforeAutospacing="1" w:after="100" w:afterAutospacing="1" w:line="240" w:lineRule="auto"/>
+        <w:spacing w:before="100" w:beforeAutospacing="1" w:after="100" w:afterAutospacing="1" w:line="240" w:lineRule="auto"/>
+        <w:ind w:left="360"/>
         <w:rPr>
           <w:rFonts w:ascii="Arial Black" w:eastAsia="Times New Roman" w:hAnsi="Arial Black" w:cs="Times New Roman"/>
           <w:b/>
@@ -13305,16 +13395,73 @@
     <w:p>
       <w:pPr>
         <w:spacing w:before="100" w:beforeAutospacing="1" w:after="100" w:afterAutospacing="1" w:line="240" w:lineRule="auto"/>
-        <w:ind w:left="360"/>
-        <w:rPr>
-          <w:rFonts w:ascii="Arial Black" w:eastAsia="Times New Roman" w:hAnsi="Arial Black" w:cs="Times New Roman"/>
-          <w:kern w:val="0"/>
-          <w:sz w:val="24"/>
-          <w:szCs w:val="24"/>
-          <w:lang w:eastAsia="en-IN" w:bidi="gu-IN"/>
-          <w14:ligatures w14:val="none"/>
-        </w:rPr>
-      </w:pPr>
+        <w:rPr>
+          <w:rFonts w:ascii="Arial Black" w:eastAsia="Times New Roman" w:hAnsi="Arial Black" w:cs="Times New Roman"/>
+          <w:kern w:val="0"/>
+          <w:sz w:val="24"/>
+          <w:szCs w:val="24"/>
+          <w:lang w:eastAsia="en-IN" w:bidi="gu-IN"/>
+          <w14:ligatures w14:val="none"/>
+        </w:rPr>
+      </w:pPr>
+    </w:p>
+    <w:p>
+      <w:pPr>
+        <w:pStyle w:val="ListParagraph"/>
+        <w:numPr>
+          <w:ilvl w:val="0"/>
+          <w:numId w:val="45"/>
+        </w:numPr>
+        <w:spacing w:before="100" w:beforeAutospacing="1" w:after="100" w:afterAutospacing="1" w:line="240" w:lineRule="auto"/>
+        <w:rPr>
+          <w:rFonts w:ascii="Arial Black" w:eastAsia="Times New Roman" w:hAnsi="Arial Black" w:cs="Times New Roman"/>
+          <w:kern w:val="0"/>
+          <w:sz w:val="24"/>
+          <w:szCs w:val="24"/>
+          <w:lang w:eastAsia="en-IN" w:bidi="gu-IN"/>
+          <w14:ligatures w14:val="none"/>
+        </w:rPr>
+      </w:pPr>
+      <w:r>
+        <w:rPr>
+          <w:rFonts w:ascii="Arial Black" w:eastAsia="Times New Roman" w:hAnsi="Arial Black" w:cs="Times New Roman"/>
+          <w:kern w:val="0"/>
+          <w:sz w:val="24"/>
+          <w:szCs w:val="24"/>
+          <w:lang w:eastAsia="en-IN" w:bidi="gu-IN"/>
+          <w14:ligatures w14:val="none"/>
+        </w:rPr>
+        <w:t>Gives full control over item UI and data binding</w:t>
+      </w:r>
+    </w:p>
+    <w:p>
+      <w:pPr>
+        <w:pStyle w:val="ListParagraph"/>
+        <w:numPr>
+          <w:ilvl w:val="0"/>
+          <w:numId w:val="45"/>
+        </w:numPr>
+        <w:spacing w:before="100" w:beforeAutospacing="1" w:after="100" w:afterAutospacing="1" w:line="240" w:lineRule="auto"/>
+        <w:rPr>
+          <w:rFonts w:ascii="Arial Black" w:eastAsia="Times New Roman" w:hAnsi="Arial Black" w:cs="Times New Roman"/>
+          <w:kern w:val="0"/>
+          <w:sz w:val="24"/>
+          <w:szCs w:val="24"/>
+          <w:lang w:eastAsia="en-IN" w:bidi="gu-IN"/>
+          <w14:ligatures w14:val="none"/>
+        </w:rPr>
+      </w:pPr>
+      <w:r>
+        <w:rPr>
+          <w:rFonts w:ascii="Arial Black" w:eastAsia="Times New Roman" w:hAnsi="Arial Black" w:cs="Times New Roman"/>
+          <w:kern w:val="0"/>
+          <w:sz w:val="24"/>
+          <w:szCs w:val="24"/>
+          <w:lang w:eastAsia="en-IN" w:bidi="gu-IN"/>
+          <w14:ligatures w14:val="none"/>
+        </w:rPr>
+        <w:t>Commonly used with ViewHolder pattern for performance</w:t>
+      </w:r>
     </w:p>
     <w:p>
       <w:pPr>
@@ -13554,58 +13701,6 @@
       <w:pPr>
         <w:spacing w:before="100" w:beforeAutospacing="1" w:after="100" w:afterAutospacing="1" w:line="240" w:lineRule="auto"/>
         <w:rPr>
-          <w:rFonts w:ascii="Arial Black" w:eastAsia="Times New Roman" w:hAnsi="Arial Black" w:cs="Times New Roman"/>
-          <w:kern w:val="0"/>
-          <w:sz w:val="24"/>
-          <w:szCs w:val="24"/>
-          <w:lang w:eastAsia="en-IN" w:bidi="gu-IN"/>
-          <w14:ligatures w14:val="none"/>
-        </w:rPr>
-      </w:pPr>
-    </w:p>
-    <w:p>
-      <w:pPr>
-        <w:spacing w:before="100" w:beforeAutospacing="1" w:after="100" w:afterAutospacing="1" w:line="240" w:lineRule="auto"/>
-        <w:rPr>
-          <w:rFonts w:ascii="Arial Black" w:eastAsia="Times New Roman" w:hAnsi="Arial Black" w:cs="Times New Roman"/>
-          <w:kern w:val="0"/>
-          <w:sz w:val="24"/>
-          <w:szCs w:val="24"/>
-          <w:lang w:eastAsia="en-IN" w:bidi="gu-IN"/>
-          <w14:ligatures w14:val="none"/>
-        </w:rPr>
-      </w:pPr>
-    </w:p>
-    <w:p>
-      <w:pPr>
-        <w:spacing w:before="100" w:beforeAutospacing="1" w:after="100" w:afterAutospacing="1" w:line="240" w:lineRule="auto"/>
-        <w:rPr>
-          <w:rFonts w:ascii="Arial Black" w:eastAsia="Times New Roman" w:hAnsi="Arial Black" w:cs="Times New Roman"/>
-          <w:kern w:val="0"/>
-          <w:sz w:val="24"/>
-          <w:szCs w:val="24"/>
-          <w:lang w:eastAsia="en-IN" w:bidi="gu-IN"/>
-          <w14:ligatures w14:val="none"/>
-        </w:rPr>
-      </w:pPr>
-    </w:p>
-    <w:p>
-      <w:pPr>
-        <w:spacing w:before="100" w:beforeAutospacing="1" w:after="100" w:afterAutospacing="1" w:line="240" w:lineRule="auto"/>
-        <w:rPr>
-          <w:rFonts w:ascii="Arial Black" w:eastAsia="Times New Roman" w:hAnsi="Arial Black" w:cs="Times New Roman"/>
-          <w:kern w:val="0"/>
-          <w:sz w:val="24"/>
-          <w:szCs w:val="24"/>
-          <w:lang w:eastAsia="en-IN" w:bidi="gu-IN"/>
-          <w14:ligatures w14:val="none"/>
-        </w:rPr>
-      </w:pPr>
-    </w:p>
-    <w:p>
-      <w:pPr>
-        <w:spacing w:before="100" w:beforeAutospacing="1" w:after="100" w:afterAutospacing="1" w:line="240" w:lineRule="auto"/>
-        <w:rPr>
           <w:rFonts w:ascii="Times New Roman" w:eastAsia="Times New Roman" w:hAnsi="Times New Roman" w:cs="Times New Roman"/>
           <w:kern w:val="0"/>
           <w:sz w:val="24"/>
@@ -13614,6 +13709,8 @@
           <w14:ligatures w14:val="none"/>
         </w:rPr>
       </w:pPr>
+      <w:bookmarkStart w:id="0" w:name="_GoBack"/>
+      <w:bookmarkEnd w:id="0"/>
       <w:r>
         <w:rPr>
           <w:rFonts w:ascii="Arial Black" w:eastAsia="Times New Roman" w:hAnsi="Arial Black" w:cs="Times New Roman"/>
@@ -17431,6 +17528,155 @@
     </w:lvl>
   </w:abstractNum>
   <w:abstractNum w:abstractNumId="6" w15:restartNumberingAfterBreak="0">
+    <w:nsid w:val="0DB330B8"/>
+    <w:multiLevelType w:val="multilevel"/>
+    <w:tmpl w:val="317A851E"/>
+    <w:lvl w:ilvl="0">
+      <w:start w:val="1"/>
+      <w:numFmt w:val="bullet"/>
+      <w:lvlText w:val=""/>
+      <w:lvlJc w:val="left"/>
+      <w:pPr>
+        <w:tabs>
+          <w:tab w:val="num" w:pos="360"/>
+        </w:tabs>
+        <w:ind w:left="360" w:hanging="360"/>
+      </w:pPr>
+      <w:rPr>
+        <w:rFonts w:ascii="Symbol" w:hAnsi="Symbol" w:hint="default"/>
+        <w:sz w:val="20"/>
+      </w:rPr>
+    </w:lvl>
+    <w:lvl w:ilvl="1" w:tentative="1">
+      <w:start w:val="1"/>
+      <w:numFmt w:val="bullet"/>
+      <w:lvlText w:val="o"/>
+      <w:lvlJc w:val="left"/>
+      <w:pPr>
+        <w:tabs>
+          <w:tab w:val="num" w:pos="1080"/>
+        </w:tabs>
+        <w:ind w:left="1080" w:hanging="360"/>
+      </w:pPr>
+      <w:rPr>
+        <w:rFonts w:ascii="Courier New" w:hAnsi="Courier New" w:hint="default"/>
+        <w:sz w:val="20"/>
+      </w:rPr>
+    </w:lvl>
+    <w:lvl w:ilvl="2" w:tentative="1">
+      <w:start w:val="1"/>
+      <w:numFmt w:val="bullet"/>
+      <w:lvlText w:val=""/>
+      <w:lvlJc w:val="left"/>
+      <w:pPr>
+        <w:tabs>
+          <w:tab w:val="num" w:pos="1800"/>
+        </w:tabs>
+        <w:ind w:left="1800" w:hanging="360"/>
+      </w:pPr>
+      <w:rPr>
+        <w:rFonts w:ascii="Wingdings" w:hAnsi="Wingdings" w:hint="default"/>
+        <w:sz w:val="20"/>
+      </w:rPr>
+    </w:lvl>
+    <w:lvl w:ilvl="3" w:tentative="1">
+      <w:start w:val="1"/>
+      <w:numFmt w:val="bullet"/>
+      <w:lvlText w:val=""/>
+      <w:lvlJc w:val="left"/>
+      <w:pPr>
+        <w:tabs>
+          <w:tab w:val="num" w:pos="2520"/>
+        </w:tabs>
+        <w:ind w:left="2520" w:hanging="360"/>
+      </w:pPr>
+      <w:rPr>
+        <w:rFonts w:ascii="Wingdings" w:hAnsi="Wingdings" w:hint="default"/>
+        <w:sz w:val="20"/>
+      </w:rPr>
+    </w:lvl>
+    <w:lvl w:ilvl="4" w:tentative="1">
+      <w:start w:val="1"/>
+      <w:numFmt w:val="bullet"/>
+      <w:lvlText w:val=""/>
+      <w:lvlJc w:val="left"/>
+      <w:pPr>
+        <w:tabs>
+          <w:tab w:val="num" w:pos="3240"/>
+        </w:tabs>
+        <w:ind w:left="3240" w:hanging="360"/>
+      </w:pPr>
+      <w:rPr>
+        <w:rFonts w:ascii="Wingdings" w:hAnsi="Wingdings" w:hint="default"/>
+        <w:sz w:val="20"/>
+      </w:rPr>
+    </w:lvl>
+    <w:lvl w:ilvl="5" w:tentative="1">
+      <w:start w:val="1"/>
+      <w:numFmt w:val="bullet"/>
+      <w:lvlText w:val=""/>
+      <w:lvlJc w:val="left"/>
+      <w:pPr>
+        <w:tabs>
+          <w:tab w:val="num" w:pos="3960"/>
+        </w:tabs>
+        <w:ind w:left="3960" w:hanging="360"/>
+      </w:pPr>
+      <w:rPr>
+        <w:rFonts w:ascii="Wingdings" w:hAnsi="Wingdings" w:hint="default"/>
+        <w:sz w:val="20"/>
+      </w:rPr>
+    </w:lvl>
+    <w:lvl w:ilvl="6" w:tentative="1">
+      <w:start w:val="1"/>
+      <w:numFmt w:val="bullet"/>
+      <w:lvlText w:val=""/>
+      <w:lvlJc w:val="left"/>
+      <w:pPr>
+        <w:tabs>
+          <w:tab w:val="num" w:pos="4680"/>
+        </w:tabs>
+        <w:ind w:left="4680" w:hanging="360"/>
+      </w:pPr>
+      <w:rPr>
+        <w:rFonts w:ascii="Wingdings" w:hAnsi="Wingdings" w:hint="default"/>
+        <w:sz w:val="20"/>
+      </w:rPr>
+    </w:lvl>
+    <w:lvl w:ilvl="7" w:tentative="1">
+      <w:start w:val="1"/>
+      <w:numFmt w:val="bullet"/>
+      <w:lvlText w:val=""/>
+      <w:lvlJc w:val="left"/>
+      <w:pPr>
+        <w:tabs>
+          <w:tab w:val="num" w:pos="5400"/>
+        </w:tabs>
+        <w:ind w:left="5400" w:hanging="360"/>
+      </w:pPr>
+      <w:rPr>
+        <w:rFonts w:ascii="Wingdings" w:hAnsi="Wingdings" w:hint="default"/>
+        <w:sz w:val="20"/>
+      </w:rPr>
+    </w:lvl>
+    <w:lvl w:ilvl="8" w:tentative="1">
+      <w:start w:val="1"/>
+      <w:numFmt w:val="bullet"/>
+      <w:lvlText w:val=""/>
+      <w:lvlJc w:val="left"/>
+      <w:pPr>
+        <w:tabs>
+          <w:tab w:val="num" w:pos="6120"/>
+        </w:tabs>
+        <w:ind w:left="6120" w:hanging="360"/>
+      </w:pPr>
+      <w:rPr>
+        <w:rFonts w:ascii="Wingdings" w:hAnsi="Wingdings" w:hint="default"/>
+        <w:sz w:val="20"/>
+      </w:rPr>
+    </w:lvl>
+  </w:abstractNum>
+  <w:abstractNum w:abstractNumId="7" w15:restartNumberingAfterBreak="0">
     <w:nsid w:val="0F1D0274"/>
     <w:multiLevelType w:val="multilevel"/>
     <w:tmpl w:val="7F929828"/>
@@ -17579,7 +17825,7 @@
       </w:rPr>
     </w:lvl>
   </w:abstractNum>
-  <w:abstractNum w:abstractNumId="7" w15:restartNumberingAfterBreak="0">
+  <w:abstractNum w:abstractNumId="8" w15:restartNumberingAfterBreak="0">
     <w:nsid w:val="1194059D"/>
     <w:multiLevelType w:val="multilevel"/>
     <w:tmpl w:val="0D20F8FA"/>
@@ -17728,7 +17974,7 @@
       </w:rPr>
     </w:lvl>
   </w:abstractNum>
-  <w:abstractNum w:abstractNumId="8" w15:restartNumberingAfterBreak="0">
+  <w:abstractNum w:abstractNumId="9" w15:restartNumberingAfterBreak="0">
     <w:nsid w:val="16B12922"/>
     <w:multiLevelType w:val="hybridMultilevel"/>
     <w:tmpl w:val="8CECD184"/>
@@ -17841,7 +18087,7 @@
       </w:rPr>
     </w:lvl>
   </w:abstractNum>
-  <w:abstractNum w:abstractNumId="9" w15:restartNumberingAfterBreak="0">
+  <w:abstractNum w:abstractNumId="10" w15:restartNumberingAfterBreak="0">
     <w:nsid w:val="171E1E9E"/>
     <w:multiLevelType w:val="multilevel"/>
     <w:tmpl w:val="8CFC45F6"/>
@@ -17990,7 +18236,7 @@
       </w:rPr>
     </w:lvl>
   </w:abstractNum>
-  <w:abstractNum w:abstractNumId="10" w15:restartNumberingAfterBreak="0">
+  <w:abstractNum w:abstractNumId="11" w15:restartNumberingAfterBreak="0">
     <w:nsid w:val="19F917B6"/>
     <w:multiLevelType w:val="multilevel"/>
     <w:tmpl w:val="9E128FFC"/>
@@ -18139,7 +18385,7 @@
       </w:rPr>
     </w:lvl>
   </w:abstractNum>
-  <w:abstractNum w:abstractNumId="11" w15:restartNumberingAfterBreak="0">
+  <w:abstractNum w:abstractNumId="12" w15:restartNumberingAfterBreak="0">
     <w:nsid w:val="1B9D7C6C"/>
     <w:multiLevelType w:val="multilevel"/>
     <w:tmpl w:val="2CDAFB1C"/>
@@ -18288,7 +18534,7 @@
       </w:rPr>
     </w:lvl>
   </w:abstractNum>
-  <w:abstractNum w:abstractNumId="12" w15:restartNumberingAfterBreak="0">
+  <w:abstractNum w:abstractNumId="13" w15:restartNumberingAfterBreak="0">
     <w:nsid w:val="1EFB318C"/>
     <w:multiLevelType w:val="multilevel"/>
     <w:tmpl w:val="211214C4"/>
@@ -18437,7 +18683,7 @@
       </w:rPr>
     </w:lvl>
   </w:abstractNum>
-  <w:abstractNum w:abstractNumId="13" w15:restartNumberingAfterBreak="0">
+  <w:abstractNum w:abstractNumId="14" w15:restartNumberingAfterBreak="0">
     <w:nsid w:val="23496162"/>
     <w:multiLevelType w:val="multilevel"/>
     <w:tmpl w:val="885EECE4"/>
@@ -18586,7 +18832,7 @@
       </w:rPr>
     </w:lvl>
   </w:abstractNum>
-  <w:abstractNum w:abstractNumId="14" w15:restartNumberingAfterBreak="0">
+  <w:abstractNum w:abstractNumId="15" w15:restartNumberingAfterBreak="0">
     <w:nsid w:val="2D40302E"/>
     <w:multiLevelType w:val="multilevel"/>
     <w:tmpl w:val="0868F2E2"/>
@@ -18735,7 +18981,7 @@
       </w:rPr>
     </w:lvl>
   </w:abstractNum>
-  <w:abstractNum w:abstractNumId="15" w15:restartNumberingAfterBreak="0">
+  <w:abstractNum w:abstractNumId="16" w15:restartNumberingAfterBreak="0">
     <w:nsid w:val="2F8670CD"/>
     <w:multiLevelType w:val="multilevel"/>
     <w:tmpl w:val="61CA1CD0"/>
@@ -18884,7 +19130,7 @@
       </w:rPr>
     </w:lvl>
   </w:abstractNum>
-  <w:abstractNum w:abstractNumId="16" w15:restartNumberingAfterBreak="0">
+  <w:abstractNum w:abstractNumId="17" w15:restartNumberingAfterBreak="0">
     <w:nsid w:val="305B5AD0"/>
     <w:multiLevelType w:val="multilevel"/>
     <w:tmpl w:val="317A851E"/>
@@ -19033,7 +19279,7 @@
       </w:rPr>
     </w:lvl>
   </w:abstractNum>
-  <w:abstractNum w:abstractNumId="17" w15:restartNumberingAfterBreak="0">
+  <w:abstractNum w:abstractNumId="18" w15:restartNumberingAfterBreak="0">
     <w:nsid w:val="315424E5"/>
     <w:multiLevelType w:val="multilevel"/>
     <w:tmpl w:val="182CBEC4"/>
@@ -19182,7 +19428,7 @@
       </w:rPr>
     </w:lvl>
   </w:abstractNum>
-  <w:abstractNum w:abstractNumId="18" w15:restartNumberingAfterBreak="0">
+  <w:abstractNum w:abstractNumId="19" w15:restartNumberingAfterBreak="0">
     <w:nsid w:val="32442168"/>
     <w:multiLevelType w:val="multilevel"/>
     <w:tmpl w:val="810AFE14"/>
@@ -19331,7 +19577,7 @@
       </w:rPr>
     </w:lvl>
   </w:abstractNum>
-  <w:abstractNum w:abstractNumId="19" w15:restartNumberingAfterBreak="0">
+  <w:abstractNum w:abstractNumId="20" w15:restartNumberingAfterBreak="0">
     <w:nsid w:val="38AE30C7"/>
     <w:multiLevelType w:val="multilevel"/>
     <w:tmpl w:val="E0BAFDC4"/>
@@ -19480,7 +19726,7 @@
       </w:rPr>
     </w:lvl>
   </w:abstractNum>
-  <w:abstractNum w:abstractNumId="20" w15:restartNumberingAfterBreak="0">
+  <w:abstractNum w:abstractNumId="21" w15:restartNumberingAfterBreak="0">
     <w:nsid w:val="390D6DCD"/>
     <w:multiLevelType w:val="multilevel"/>
     <w:tmpl w:val="4A6C8BE6"/>
@@ -19629,7 +19875,7 @@
       </w:rPr>
     </w:lvl>
   </w:abstractNum>
-  <w:abstractNum w:abstractNumId="21" w15:restartNumberingAfterBreak="0">
+  <w:abstractNum w:abstractNumId="22" w15:restartNumberingAfterBreak="0">
     <w:nsid w:val="3EAE592D"/>
     <w:multiLevelType w:val="multilevel"/>
     <w:tmpl w:val="D358833C"/>
@@ -19778,7 +20024,7 @@
       </w:rPr>
     </w:lvl>
   </w:abstractNum>
-  <w:abstractNum w:abstractNumId="22" w15:restartNumberingAfterBreak="0">
+  <w:abstractNum w:abstractNumId="23" w15:restartNumberingAfterBreak="0">
     <w:nsid w:val="4051145B"/>
     <w:multiLevelType w:val="multilevel"/>
     <w:tmpl w:val="21D0A380"/>
@@ -19927,7 +20173,7 @@
       </w:rPr>
     </w:lvl>
   </w:abstractNum>
-  <w:abstractNum w:abstractNumId="23" w15:restartNumberingAfterBreak="0">
+  <w:abstractNum w:abstractNumId="24" w15:restartNumberingAfterBreak="0">
     <w:nsid w:val="4A207CCC"/>
     <w:multiLevelType w:val="multilevel"/>
     <w:tmpl w:val="C9CE9B88"/>
@@ -20076,7 +20322,7 @@
       </w:rPr>
     </w:lvl>
   </w:abstractNum>
-  <w:abstractNum w:abstractNumId="24" w15:restartNumberingAfterBreak="0">
+  <w:abstractNum w:abstractNumId="25" w15:restartNumberingAfterBreak="0">
     <w:nsid w:val="4D601704"/>
     <w:multiLevelType w:val="multilevel"/>
     <w:tmpl w:val="45821E04"/>
@@ -20225,7 +20471,7 @@
       </w:rPr>
     </w:lvl>
   </w:abstractNum>
-  <w:abstractNum w:abstractNumId="25" w15:restartNumberingAfterBreak="0">
+  <w:abstractNum w:abstractNumId="26" w15:restartNumberingAfterBreak="0">
     <w:nsid w:val="551D0DE2"/>
     <w:multiLevelType w:val="multilevel"/>
     <w:tmpl w:val="75E09A6C"/>
@@ -20374,7 +20620,7 @@
       </w:rPr>
     </w:lvl>
   </w:abstractNum>
-  <w:abstractNum w:abstractNumId="26" w15:restartNumberingAfterBreak="0">
+  <w:abstractNum w:abstractNumId="27" w15:restartNumberingAfterBreak="0">
     <w:nsid w:val="552A783A"/>
     <w:multiLevelType w:val="multilevel"/>
     <w:tmpl w:val="53204384"/>
@@ -20523,7 +20769,7 @@
       </w:rPr>
     </w:lvl>
   </w:abstractNum>
-  <w:abstractNum w:abstractNumId="27" w15:restartNumberingAfterBreak="0">
+  <w:abstractNum w:abstractNumId="28" w15:restartNumberingAfterBreak="0">
     <w:nsid w:val="586735D3"/>
     <w:multiLevelType w:val="multilevel"/>
     <w:tmpl w:val="4E823CE0"/>
@@ -20672,7 +20918,7 @@
       </w:rPr>
     </w:lvl>
   </w:abstractNum>
-  <w:abstractNum w:abstractNumId="28" w15:restartNumberingAfterBreak="0">
+  <w:abstractNum w:abstractNumId="29" w15:restartNumberingAfterBreak="0">
     <w:nsid w:val="59E73702"/>
     <w:multiLevelType w:val="multilevel"/>
     <w:tmpl w:val="FE0E015C"/>
@@ -20821,7 +21067,7 @@
       </w:rPr>
     </w:lvl>
   </w:abstractNum>
-  <w:abstractNum w:abstractNumId="29" w15:restartNumberingAfterBreak="0">
+  <w:abstractNum w:abstractNumId="30" w15:restartNumberingAfterBreak="0">
     <w:nsid w:val="5ECA2A12"/>
     <w:multiLevelType w:val="multilevel"/>
     <w:tmpl w:val="60728C82"/>
@@ -20970,7 +21216,7 @@
       </w:rPr>
     </w:lvl>
   </w:abstractNum>
-  <w:abstractNum w:abstractNumId="30" w15:restartNumberingAfterBreak="0">
+  <w:abstractNum w:abstractNumId="31" w15:restartNumberingAfterBreak="0">
     <w:nsid w:val="5F8D63EB"/>
     <w:multiLevelType w:val="multilevel"/>
     <w:tmpl w:val="F75E7D58"/>
@@ -21119,7 +21365,7 @@
       </w:rPr>
     </w:lvl>
   </w:abstractNum>
-  <w:abstractNum w:abstractNumId="31" w15:restartNumberingAfterBreak="0">
+  <w:abstractNum w:abstractNumId="32" w15:restartNumberingAfterBreak="0">
     <w:nsid w:val="60A3059A"/>
     <w:multiLevelType w:val="multilevel"/>
     <w:tmpl w:val="46AE07B2"/>
@@ -21268,7 +21514,7 @@
       </w:rPr>
     </w:lvl>
   </w:abstractNum>
-  <w:abstractNum w:abstractNumId="32" w15:restartNumberingAfterBreak="0">
+  <w:abstractNum w:abstractNumId="33" w15:restartNumberingAfterBreak="0">
     <w:nsid w:val="63B30CB6"/>
     <w:multiLevelType w:val="multilevel"/>
     <w:tmpl w:val="9E186D34"/>
@@ -21417,7 +21663,7 @@
       </w:rPr>
     </w:lvl>
   </w:abstractNum>
-  <w:abstractNum w:abstractNumId="33" w15:restartNumberingAfterBreak="0">
+  <w:abstractNum w:abstractNumId="34" w15:restartNumberingAfterBreak="0">
     <w:nsid w:val="67723B76"/>
     <w:multiLevelType w:val="multilevel"/>
     <w:tmpl w:val="B00AEF72"/>
@@ -21566,7 +21812,7 @@
       </w:rPr>
     </w:lvl>
   </w:abstractNum>
-  <w:abstractNum w:abstractNumId="34" w15:restartNumberingAfterBreak="0">
+  <w:abstractNum w:abstractNumId="35" w15:restartNumberingAfterBreak="0">
     <w:nsid w:val="679F1195"/>
     <w:multiLevelType w:val="multilevel"/>
     <w:tmpl w:val="7528EC18"/>
@@ -21715,7 +21961,7 @@
       </w:rPr>
     </w:lvl>
   </w:abstractNum>
-  <w:abstractNum w:abstractNumId="35" w15:restartNumberingAfterBreak="0">
+  <w:abstractNum w:abstractNumId="36" w15:restartNumberingAfterBreak="0">
     <w:nsid w:val="68AD12FC"/>
     <w:multiLevelType w:val="multilevel"/>
     <w:tmpl w:val="11622028"/>
@@ -21864,7 +22110,7 @@
       </w:rPr>
     </w:lvl>
   </w:abstractNum>
-  <w:abstractNum w:abstractNumId="36" w15:restartNumberingAfterBreak="0">
+  <w:abstractNum w:abstractNumId="37" w15:restartNumberingAfterBreak="0">
     <w:nsid w:val="6A2D05A8"/>
     <w:multiLevelType w:val="multilevel"/>
     <w:tmpl w:val="386842F4"/>
@@ -22013,7 +22259,7 @@
       </w:rPr>
     </w:lvl>
   </w:abstractNum>
-  <w:abstractNum w:abstractNumId="37" w15:restartNumberingAfterBreak="0">
+  <w:abstractNum w:abstractNumId="38" w15:restartNumberingAfterBreak="0">
     <w:nsid w:val="6AE81382"/>
     <w:multiLevelType w:val="multilevel"/>
     <w:tmpl w:val="1E146A56"/>
@@ -22162,7 +22408,7 @@
       </w:rPr>
     </w:lvl>
   </w:abstractNum>
-  <w:abstractNum w:abstractNumId="38" w15:restartNumberingAfterBreak="0">
+  <w:abstractNum w:abstractNumId="39" w15:restartNumberingAfterBreak="0">
     <w:nsid w:val="6BB72D12"/>
     <w:multiLevelType w:val="multilevel"/>
     <w:tmpl w:val="7D04A30E"/>
@@ -22311,7 +22557,7 @@
       </w:rPr>
     </w:lvl>
   </w:abstractNum>
-  <w:abstractNum w:abstractNumId="39" w15:restartNumberingAfterBreak="0">
+  <w:abstractNum w:abstractNumId="40" w15:restartNumberingAfterBreak="0">
     <w:nsid w:val="79F33D48"/>
     <w:multiLevelType w:val="multilevel"/>
     <w:tmpl w:val="59322AB8"/>
@@ -22460,7 +22706,7 @@
       </w:rPr>
     </w:lvl>
   </w:abstractNum>
-  <w:abstractNum w:abstractNumId="40" w15:restartNumberingAfterBreak="0">
+  <w:abstractNum w:abstractNumId="41" w15:restartNumberingAfterBreak="0">
     <w:nsid w:val="7A9C77F7"/>
     <w:multiLevelType w:val="multilevel"/>
     <w:tmpl w:val="1302BA94"/>
@@ -22609,7 +22855,7 @@
       </w:rPr>
     </w:lvl>
   </w:abstractNum>
-  <w:abstractNum w:abstractNumId="41" w15:restartNumberingAfterBreak="0">
+  <w:abstractNum w:abstractNumId="42" w15:restartNumberingAfterBreak="0">
     <w:nsid w:val="7B914F15"/>
     <w:multiLevelType w:val="multilevel"/>
     <w:tmpl w:val="4BA0AB94"/>
@@ -22758,7 +23004,7 @@
       </w:rPr>
     </w:lvl>
   </w:abstractNum>
-  <w:abstractNum w:abstractNumId="42" w15:restartNumberingAfterBreak="0">
+  <w:abstractNum w:abstractNumId="43" w15:restartNumberingAfterBreak="0">
     <w:nsid w:val="7D113FF9"/>
     <w:multiLevelType w:val="multilevel"/>
     <w:tmpl w:val="FA1A64B0"/>
@@ -22907,7 +23153,7 @@
       </w:rPr>
     </w:lvl>
   </w:abstractNum>
-  <w:abstractNum w:abstractNumId="43" w15:restartNumberingAfterBreak="0">
+  <w:abstractNum w:abstractNumId="44" w15:restartNumberingAfterBreak="0">
     <w:nsid w:val="7FFE177D"/>
     <w:multiLevelType w:val="multilevel"/>
     <w:tmpl w:val="93EC2A4A"/>
@@ -23057,136 +23303,139 @@
     </w:lvl>
   </w:abstractNum>
   <w:num w:numId="1">
-    <w:abstractNumId w:val="16"/>
+    <w:abstractNumId w:val="17"/>
   </w:num>
   <w:num w:numId="2">
-    <w:abstractNumId w:val="12"/>
+    <w:abstractNumId w:val="13"/>
   </w:num>
   <w:num w:numId="3">
-    <w:abstractNumId w:val="25"/>
+    <w:abstractNumId w:val="26"/>
   </w:num>
   <w:num w:numId="4">
-    <w:abstractNumId w:val="31"/>
+    <w:abstractNumId w:val="32"/>
   </w:num>
   <w:num w:numId="5">
-    <w:abstractNumId w:val="27"/>
+    <w:abstractNumId w:val="28"/>
   </w:num>
   <w:num w:numId="6">
-    <w:abstractNumId w:val="35"/>
+    <w:abstractNumId w:val="36"/>
   </w:num>
   <w:num w:numId="7">
-    <w:abstractNumId w:val="39"/>
+    <w:abstractNumId w:val="40"/>
   </w:num>
   <w:num w:numId="8">
-    <w:abstractNumId w:val="10"/>
+    <w:abstractNumId w:val="11"/>
   </w:num>
   <w:num w:numId="9">
-    <w:abstractNumId w:val="7"/>
+    <w:abstractNumId w:val="8"/>
   </w:num>
   <w:num w:numId="10">
     <w:abstractNumId w:val="2"/>
   </w:num>
   <w:num w:numId="11">
-    <w:abstractNumId w:val="23"/>
+    <w:abstractNumId w:val="24"/>
   </w:num>
   <w:num w:numId="12">
     <w:abstractNumId w:val="4"/>
   </w:num>
   <w:num w:numId="13">
-    <w:abstractNumId w:val="36"/>
+    <w:abstractNumId w:val="37"/>
   </w:num>
   <w:num w:numId="14">
-    <w:abstractNumId w:val="6"/>
+    <w:abstractNumId w:val="7"/>
   </w:num>
   <w:num w:numId="15">
-    <w:abstractNumId w:val="32"/>
+    <w:abstractNumId w:val="33"/>
   </w:num>
   <w:num w:numId="16">
-    <w:abstractNumId w:val="29"/>
+    <w:abstractNumId w:val="30"/>
   </w:num>
   <w:num w:numId="17">
-    <w:abstractNumId w:val="38"/>
+    <w:abstractNumId w:val="39"/>
   </w:num>
   <w:num w:numId="18">
-    <w:abstractNumId w:val="33"/>
+    <w:abstractNumId w:val="34"/>
   </w:num>
   <w:num w:numId="19">
-    <w:abstractNumId w:val="19"/>
+    <w:abstractNumId w:val="20"/>
   </w:num>
   <w:num w:numId="20">
-    <w:abstractNumId w:val="34"/>
+    <w:abstractNumId w:val="35"/>
   </w:num>
   <w:num w:numId="21">
     <w:abstractNumId w:val="3"/>
   </w:num>
   <w:num w:numId="22">
-    <w:abstractNumId w:val="22"/>
+    <w:abstractNumId w:val="23"/>
   </w:num>
   <w:num w:numId="23">
-    <w:abstractNumId w:val="26"/>
+    <w:abstractNumId w:val="27"/>
   </w:num>
   <w:num w:numId="24">
-    <w:abstractNumId w:val="17"/>
+    <w:abstractNumId w:val="18"/>
   </w:num>
   <w:num w:numId="25">
     <w:abstractNumId w:val="0"/>
   </w:num>
   <w:num w:numId="26">
-    <w:abstractNumId w:val="30"/>
+    <w:abstractNumId w:val="31"/>
   </w:num>
   <w:num w:numId="27">
     <w:abstractNumId w:val="5"/>
   </w:num>
   <w:num w:numId="28">
-    <w:abstractNumId w:val="9"/>
+    <w:abstractNumId w:val="10"/>
   </w:num>
   <w:num w:numId="29">
-    <w:abstractNumId w:val="18"/>
+    <w:abstractNumId w:val="19"/>
   </w:num>
   <w:num w:numId="30">
     <w:abstractNumId w:val="1"/>
   </w:num>
   <w:num w:numId="31">
+    <w:abstractNumId w:val="16"/>
+  </w:num>
+  <w:num w:numId="32">
+    <w:abstractNumId w:val="25"/>
+  </w:num>
+  <w:num w:numId="33">
+    <w:abstractNumId w:val="44"/>
+  </w:num>
+  <w:num w:numId="34">
+    <w:abstractNumId w:val="14"/>
+  </w:num>
+  <w:num w:numId="35">
+    <w:abstractNumId w:val="9"/>
+  </w:num>
+  <w:num w:numId="36">
+    <w:abstractNumId w:val="12"/>
+  </w:num>
+  <w:num w:numId="37">
+    <w:abstractNumId w:val="41"/>
+  </w:num>
+  <w:num w:numId="38">
     <w:abstractNumId w:val="15"/>
   </w:num>
-  <w:num w:numId="32">
-    <w:abstractNumId w:val="24"/>
+  <w:num w:numId="39">
+    <w:abstractNumId w:val="29"/>
   </w:num>
-  <w:num w:numId="33">
+  <w:num w:numId="40">
+    <w:abstractNumId w:val="21"/>
+  </w:num>
+  <w:num w:numId="41">
+    <w:abstractNumId w:val="22"/>
+  </w:num>
+  <w:num w:numId="42">
+    <w:abstractNumId w:val="42"/>
+  </w:num>
+  <w:num w:numId="43">
+    <w:abstractNumId w:val="38"/>
+  </w:num>
+  <w:num w:numId="44">
     <w:abstractNumId w:val="43"/>
   </w:num>
-  <w:num w:numId="34">
-    <w:abstractNumId w:val="13"/>
-  </w:num>
-  <w:num w:numId="35">
-    <w:abstractNumId w:val="8"/>
-  </w:num>
-  <w:num w:numId="36">
-    <w:abstractNumId w:val="11"/>
-  </w:num>
-  <w:num w:numId="37">
-    <w:abstractNumId w:val="40"/>
-  </w:num>
-  <w:num w:numId="38">
-    <w:abstractNumId w:val="14"/>
-  </w:num>
-  <w:num w:numId="39">
-    <w:abstractNumId w:val="28"/>
-  </w:num>
-  <w:num w:numId="40">
-    <w:abstractNumId w:val="20"/>
-  </w:num>
-  <w:num w:numId="41">
-    <w:abstractNumId w:val="21"/>
-  </w:num>
-  <w:num w:numId="42">
-    <w:abstractNumId w:val="41"/>
-  </w:num>
-  <w:num w:numId="43">
-    <w:abstractNumId w:val="37"/>
-  </w:num>
-  <w:num w:numId="44">
-    <w:abstractNumId w:val="42"/>
+  <w:num w:numId="45">
+    <w:abstractNumId w:val="6"/>
   </w:num>
   <w:numIdMacAtCleanup w:val="22"/>
 </w:numbering>
@@ -23613,7 +23862,6 @@
   <w:style w:type="character" w:default="1" w:styleId="DefaultParagraphFont">
     <w:name w:val="Default Paragraph Font"/>
     <w:uiPriority w:val="1"/>
-    <w:semiHidden/>
     <w:unhideWhenUsed/>
   </w:style>
   <w:style w:type="table" w:default="1" w:styleId="TableNormal">
@@ -24144,7 +24392,7 @@
 </file>
 
 <file path=customXml/itemProps1.xml><?xml version="1.0" encoding="utf-8"?>
-<ds:datastoreItem xmlns:ds="http://schemas.openxmlformats.org/officeDocument/2006/customXml" ds:itemID="{6E7343CF-0D2D-4EF1-97B3-2B4A09123C3A}">
+<ds:datastoreItem xmlns:ds="http://schemas.openxmlformats.org/officeDocument/2006/customXml" ds:itemID="{26E2B5E0-D5FE-4611-83E0-0413F66C63CB}">
   <ds:schemaRefs>
     <ds:schemaRef ds:uri="http://schemas.openxmlformats.org/officeDocument/2006/bibliography"/>
   </ds:schemaRefs>

</xml_diff>